<commit_message>
chore(docs): ADRs añadidos y documentación y LEARNING actualizada
</commit_message>
<xml_diff>
--- a/docs/architecture/CoreTransact-Mesh_Documentacion_Inicial.docx
+++ b/docs/architecture/CoreTransact-Mesh_Documentacion_Inicial.docx
@@ -1186,7 +1186,13 @@
           </w:tcPr>
           <w:p>
             <w:r>
-              <w:t>Ingesta: Java 21 + Spring Boot 3 (WebFlux) + Redis. Ledger y Conciliación: .NET 10 (C# 14). Datos: PostgreSQL 16 y MongoDB 7. Mensajería: RabbitMQ. RPC: gRPC.</w:t>
+              <w:t xml:space="preserve">Ingesta: Java 21 + Spring Boot </w:t>
+            </w:r>
+            <w:r>
+              <w:t>4.1.x</w:t>
+            </w:r>
+            <w:r>
+              <w:t xml:space="preserve"> (WebFlux) + Redis. Ledger y Conciliación: .NET 10 (C# 14). Datos: PostgreSQL 16 y MongoDB 7. Mensajería: RabbitMQ. RPC: gRPC.</w:t>
             </w:r>
           </w:p>
         </w:tc>
@@ -10369,6 +10375,7 @@
   <w:style w:type="character" w:default="1" w:styleId="Fuentedeprrafopredeter">
     <w:name w:val="Default Paragraph Font"/>
     <w:uiPriority w:val="1"/>
+    <w:semiHidden/>
     <w:unhideWhenUsed/>
   </w:style>
   <w:style w:type="table" w:default="1" w:styleId="Tablanormal">

</xml_diff>

<commit_message>
D01 webflux skeleton (#3)
* chore(docs): ADRs añadidos y documentación y LEARNING actualizada

* feat(ingesta): esqueleto WebFlux hexagonal y health [SCRUM-25]

* feat(ingesta): esqueleto WebFlux hexagonal y health [SCRUM-25] y LEARNING.md actualizado
</commit_message>
<xml_diff>
--- a/docs/architecture/CoreTransact-Mesh_Documentacion_Inicial.docx
+++ b/docs/architecture/CoreTransact-Mesh_Documentacion_Inicial.docx
@@ -1186,7 +1186,13 @@
           </w:tcPr>
           <w:p>
             <w:r>
-              <w:t>Ingesta: Java 21 + Spring Boot 3 (WebFlux) + Redis. Ledger y Conciliación: .NET 10 (C# 14). Datos: PostgreSQL 16 y MongoDB 7. Mensajería: RabbitMQ. RPC: gRPC.</w:t>
+              <w:t xml:space="preserve">Ingesta: Java 21 + Spring Boot </w:t>
+            </w:r>
+            <w:r>
+              <w:t>4.1.x</w:t>
+            </w:r>
+            <w:r>
+              <w:t xml:space="preserve"> (WebFlux) + Redis. Ledger y Conciliación: .NET 10 (C# 14). Datos: PostgreSQL 16 y MongoDB 7. Mensajería: RabbitMQ. RPC: gRPC.</w:t>
             </w:r>
           </w:p>
         </w:tc>
@@ -10369,6 +10375,7 @@
   <w:style w:type="character" w:default="1" w:styleId="Fuentedeprrafopredeter">
     <w:name w:val="Default Paragraph Font"/>
     <w:uiPriority w:val="1"/>
+    <w:semiHidden/>
     <w:unhideWhenUsed/>
   </w:style>
   <w:style w:type="table" w:default="1" w:styleId="Tablanormal">

</xml_diff>